<commit_message>
Updated With ne Dashboard
</commit_message>
<xml_diff>
--- a/output/Business_Proposal.docx
+++ b/output/Business_Proposal.docx
@@ -37,7 +37,29 @@
     </w:p>
     <w:p>
       <w:r>
-        <w:t>Integrate AI solutions to revolutionize education by enhancing student outcomes through advanced analytics and personalized learning recommendations. Streamline administrative tasks for efficiency gains, offering cost-effective, scalable, and user-friendly technologies tailored to your needs. Elevate educational standards while reducing operational burdens.</w:t>
+        <w:t>Executive Summary</w:t>
+        <w:br/>
+        <w:br/>
+        <w:t>In an era where gaming experiences are evolving rapidly, our innovative platform stands at the forefront of revolutionizing the industry. This cutting-edge platform is designed to captivate and engage players through unparalleled user experience and robust community features.</w:t>
+        <w:br/>
+        <w:br/>
+        <w:t>Key Features:</w:t>
+        <w:br/>
+        <w:t>1. Seamless Integration: Our platform offers a seamless transition between single-player adventures and multiplayer sessions.</w:t>
+        <w:br/>
+        <w:t>2. Dynamic Social Interaction: With advanced chat functionalities and real-time collaboration tools, users can connect with friends and fellow gamers more effectively than ever before.</w:t>
+        <w:br/>
+        <w:t>3. Personalized Content: Tailored gaming experiences ensure that every player finds content that resonates uniquely with their preferences.</w:t>
+        <w:br/>
+        <w:br/>
+        <w:t>Primary Benefits:</w:t>
+        <w:br/>
+        <w:t>1. Enhanced Gameplay: Enjoy a richer, more immersive gaming experience with state-of-the-art graphics and intuitive controls.</w:t>
+        <w:br/>
+        <w:t>2. Strong Community Engagement: Foster deeper connections within the community through engaging events and interactive forums.</w:t>
+        <w:br/>
+        <w:br/>
+        <w:t>We invite you to explore our platform and witness firsthand how it transforms the way you play. Join us today and step into a new dimension of gaming!</w:t>
       </w:r>
     </w:p>
     <w:p>
@@ -48,27 +70,22 @@
         <w:rPr>
           <w:sz w:val="32"/>
         </w:rPr>
-        <w:t>Introduction to AI in Education</w:t>
+        <w:t>Identify Key Features</w:t>
       </w:r>
     </w:p>
     <w:p>
       <w:r>
-        <w:t>Introduction to AI in Education</w:t>
+        <w:t>Identify Key Features:</w:t>
         <w:br/>
+        <w:t>- Highlight innovative gameplay mechanics that provide a unique player experience.</w:t>
         <w:br/>
-        <w:t>- Highlight the growing trend of AI in education, emphasizing its potential to revolutionize teaching and learning processes.</w:t>
+        <w:t>- Emphasize social features designed to foster community engagement and collaboration.</w:t>
         <w:br/>
+        <w:t>- Showcase impressive graphics and immersive environments to captivate players.</w:t>
         <w:br/>
-        <w:t>- Outline key benefits such as enhanced student engagement, personalized learning experiences, and more efficient administrative workflows.</w:t>
+        <w:t>- Describe compelling narrative elements that keep gamers invested in the story.</w:t>
         <w:br/>
-        <w:br/>
-        <w:t>- Mention recent studies indicating that AI can lead to significant improvements in academic performance and retention rates.</w:t>
-        <w:br/>
-        <w:br/>
-        <w:t>- Discuss how AI solutions offer cost-effective alternatives by optimizing resource allocation and reducing operational costs.</w:t>
-        <w:br/>
-        <w:br/>
-        <w:t>- Stress the importance of user-friendly and scalable technologies designed for diverse school environments.</w:t>
+        <w:t>- Outline personalized progression systems that reward player effort and creativity.</w:t>
       </w:r>
     </w:p>
     <w:p>
@@ -79,34 +96,23 @@
         <w:rPr>
           <w:sz w:val="32"/>
         </w:rPr>
-        <w:t>Specific AI Solutions for Schools</w:t>
+        <w:t>Create Engaging Storyline</w:t>
       </w:r>
     </w:p>
     <w:p>
       <w:r>
-        <w:t>- **Student Performance Analysis:**</w:t>
-        <w:br/>
-        <w:t xml:space="preserve">  - Automated grading and assessment tools provide real-time data tracking for individual student progress.</w:t>
+        <w:t>Create an Engaging Storyline</w:t>
         <w:br/>
         <w:br/>
-        <w:t>- **Personalized Learning Recommendations:**</w:t>
+        <w:t>- Develop a relatable protagonist who faces a challenge that players can empathize with.</w:t>
         <w:br/>
-        <w:t xml:space="preserve">  - Adaptive learning algorithms tailor content to meet individual student needs, enhancing engagement and improving outcomes with customized study plans.</w:t>
+        <w:t>- Integrate product features as tools or allies in the storyline’s progression.</w:t>
         <w:br/>
+        <w:t>- Conclude with an emotional resolution that underscores the benefits of using your product/service.</w:t>
         <w:br/>
-        <w:t>- **Administrative Automation:**</w:t>
+        <w:t>- Incorporate player choices and outcomes to boost engagement.</w:t>
         <w:br/>
-        <w:t xml:space="preserve">  - Streamlined scheduling and event management systems reduce administrative workload through automated data entry and report generation.</w:t>
-        <w:br/>
-        <w:br/>
-        <w:t>- **Cost-Effective Solutions:**</w:t>
-        <w:br/>
-        <w:t xml:space="preserve">  - Scalable pricing models fit various budget constraints. Initial assessment periods are available at no cost.</w:t>
-        <w:br/>
-        <w:br/>
-        <w:t>- **User-Friendly Interface:**</w:t>
-        <w:br/>
-        <w:t xml:space="preserve">  - An intuitive design facilitates easy adoption by educators and administrators.</w:t>
+        <w:t>- Use vivid descriptions and sensory details to bring the narrative to life.</w:t>
       </w:r>
     </w:p>
     <w:p>
@@ -117,72 +123,12 @@
         <w:rPr>
           <w:sz w:val="32"/>
         </w:rPr>
-        <w:t>Benefits and Case Studies</w:t>
+        <w:t>Emotional Appeal</w:t>
       </w:r>
     </w:p>
     <w:p>
       <w:r>
-        <w:t>- **Enhanced Student Performance:** AI tools analyze student data to provide personalized learning recommendations, leading to improved academic outcomes. For example, a case study from Springfield High School reported a 20% increase in test scores after integrating these solutions.</w:t>
-        <w:br/>
-        <w:br/>
-        <w:t>- **Streamlined Administrative Tasks:** Automated administrative processes reduce workload and free up time for educators. At Lincoln Middle School, the successful implementation eliminated over 30 hours of manual data entry weekly, allowing staff to focus on teaching.</w:t>
-        <w:br/>
-        <w:br/>
-        <w:t>- **Cost-Effective Solutions:** Scalable AI technologies offer cost savings without compromising quality. Tech Valley High demonstrated a 15% reduction in operational costs while enhancing educational outcomes.</w:t>
-        <w:br/>
-        <w:br/>
-        <w:t>- **User-Friendly Interface:** Intuitive design ensures easy adoption by educators and administrators. A study at Greenfield Academy found that over 90% of users found the platform simple to use, with minimal training required.</w:t>
-        <w:br/>
-        <w:br/>
-        <w:t>- **Scalable Implementation:** Solutions can be easily adapted to different school sizes and needs, ensuring long-term benefits. Willow Creek Elementary’s example showed how their AI tools scaled seamlessly as the student population grew by 25%.</w:t>
-      </w:r>
-    </w:p>
-    <w:p>
-      <w:pPr>
-        <w:pStyle w:val="Heading2"/>
-      </w:pPr>
-      <w:r>
-        <w:rPr>
-          <w:sz w:val="32"/>
-        </w:rPr>
-        <w:t>Implementation Strategy</w:t>
-      </w:r>
-    </w:p>
-    <w:p>
-      <w:r>
-        <w:t>- Develop a detailed project plan and timeline, encompassing phases for pilot testing, full implementation, and ongoing support.</w:t>
-        <w:br/>
-        <w:t>- Identify key stakeholders within the school community and assign roles for each phase.</w:t>
-        <w:br/>
-        <w:t>- Procure necessary hardware and software resources, ensuring they are cost-effective and scalable.</w:t>
-        <w:br/>
-        <w:t>- Train staff on the use of AI tools, focusing on student performance analysis, personalized learning, and administrative automation.</w:t>
-        <w:br/>
-        <w:t>- Establish a feedback loop for continuous improvement and integration of new features based on user input.</w:t>
-      </w:r>
-    </w:p>
-    <w:p>
-      <w:pPr>
-        <w:pStyle w:val="Heading2"/>
-      </w:pPr>
-      <w:r>
-        <w:rPr>
-          <w:sz w:val="32"/>
-        </w:rPr>
-        <w:t>Conclusion and Next Steps</w:t>
-      </w:r>
-    </w:p>
-    <w:p>
-      <w:r>
-        <w:t>- Review and incorporate feedback from school administrators to refine AI solution proposals.</w:t>
-        <w:br/>
-        <w:t>- Schedule a demonstration of selected AI tools for key stakeholders.</w:t>
-        <w:br/>
-        <w:t>- Establish a timeline for implementation, prioritizing administrative tasks.</w:t>
-        <w:br/>
-        <w:t>- Allocate budgetary resources for AI integration, ensuring cost-effectiveness.</w:t>
-        <w:br/>
-        <w:t>- Form a task force comprising educators, IT staff, and administration to oversee the project.</w:t>
+        <w:t>Craft a compelling narrative that resonates with your audience's personal experiences and aspirations. Highlight how our product or service can be a catalyst for memorable gaming moments and achievements. Use emotive language to evoke feelings of accomplishment, excitement, and community within our offering. Present real-life examples or testimonials from satisfied users to foster empathy and trust. Conclude with a powerful call-to-action that encourages immediate engagement, promising an unique emotional journey.</w:t>
       </w:r>
     </w:p>
     <w:sectPr>

</xml_diff>